<commit_message>
Silverlagret klart. Paus för ikväll.
</commit_message>
<xml_diff>
--- a/Planering - ny.docx
+++ b/Planering - ny.docx
@@ -2,6 +2,407 @@
 <file path=word/document.xml><?xml version="1.0" encoding="utf-8"?>
 <w:document xmlns:wpc="http://schemas.microsoft.com/office/word/2010/wordprocessingCanvas" xmlns:cx="http://schemas.microsoft.com/office/drawing/2014/chartex" xmlns:cx1="http://schemas.microsoft.com/office/drawing/2015/9/8/chartex" xmlns:cx2="http://schemas.microsoft.com/office/drawing/2015/10/21/chartex" xmlns:cx3="http://schemas.microsoft.com/office/drawing/2016/5/9/chartex" xmlns:cx4="http://schemas.microsoft.com/office/drawing/2016/5/10/chartex" xmlns:cx5="http://schemas.microsoft.com/office/drawing/2016/5/11/chartex" xmlns:cx6="http://schemas.microsoft.com/office/drawing/2016/5/12/chartex" xmlns:cx7="http://schemas.microsoft.com/office/drawing/2016/5/13/chartex" xmlns:cx8="http://schemas.microsoft.com/office/drawing/2016/5/14/chartex" xmlns:mc="http://schemas.openxmlformats.org/markup-compatibility/2006" xmlns:aink="http://schemas.microsoft.com/office/drawing/2016/ink" xmlns:am3d="http://schemas.microsoft.com/office/drawing/2017/model3d" xmlns:o="urn:schemas-microsoft-com:office:office" xmlns:oel="http://schemas.microsoft.com/office/2019/extlst" xmlns:r="http://schemas.openxmlformats.org/officeDocument/2006/relationships" xmlns:m="http://schemas.openxmlformats.org/officeDocument/2006/math" xmlns:v="urn:schemas-microsoft-com:vml" xmlns:wp14="http://schemas.microsoft.com/office/word/2010/wordprocessingDrawing" xmlns:wp="http://schemas.openxmlformats.org/drawingml/2006/wordprocessingDrawing" xmlns:w10="urn:schemas-microsoft-com:office:word" xmlns:w="http://schemas.openxmlformats.org/wordprocessingml/2006/main" xmlns:w14="http://schemas.microsoft.com/office/word/2010/wordml" xmlns:w15="http://schemas.microsoft.com/office/word/2012/wordml" xmlns:w16cex="http://schemas.microsoft.com/office/word/2018/wordml/cex" xmlns:w16cid="http://schemas.microsoft.com/office/word/2016/wordml/cid" xmlns:w16="http://schemas.microsoft.com/office/word/2018/wordml" xmlns:w16du="http://schemas.microsoft.com/office/word/2023/wordml/word16du" xmlns:w16sdtdh="http://schemas.microsoft.com/office/word/2020/wordml/sdtdatahash" xmlns:w16sdtfl="http://schemas.microsoft.com/office/word/2024/wordml/sdtformatlock" xmlns:w16se="http://schemas.microsoft.com/office/word/2015/wordml/symex" xmlns:wpg="http://schemas.microsoft.com/office/word/2010/wordprocessingGroup" xmlns:wpi="http://schemas.microsoft.com/office/word/2010/wordprocessingInk" xmlns:wne="http://schemas.microsoft.com/office/word/2006/wordml" xmlns:wps="http://schemas.microsoft.com/office/word/2010/wordprocessingShape" mc:Ignorable="w14 w15 w16se w16cid w16 w16cex w16sdtdh w16sdtfl w16du wp14">
   <w:body>
+    <w:p>
+      <w:pPr>
+        <w:rPr>
+          <w:lang w:val="en-US"/>
+        </w:rPr>
+      </w:pPr>
+      <w:proofErr w:type="spellStart"/>
+      <w:r>
+        <w:rPr>
+          <w:lang w:val="en-US"/>
+        </w:rPr>
+        <w:t>Fredag</w:t>
+      </w:r>
+      <w:proofErr w:type="spellEnd"/>
+      <w:r>
+        <w:rPr>
+          <w:lang w:val="en-US"/>
+        </w:rPr>
+        <w:t xml:space="preserve"> </w:t>
+      </w:r>
+      <w:proofErr w:type="spellStart"/>
+      <w:r>
+        <w:rPr>
+          <w:lang w:val="en-US"/>
+        </w:rPr>
+        <w:t>morgon</w:t>
+      </w:r>
+      <w:proofErr w:type="spellEnd"/>
+      <w:r>
+        <w:rPr>
+          <w:lang w:val="en-US"/>
+        </w:rPr>
+        <w:t>:</w:t>
+      </w:r>
+    </w:p>
+    <w:p>
+      <w:pPr>
+        <w:rPr>
+          <w:lang w:val="en-US"/>
+        </w:rPr>
+      </w:pPr>
+      <w:r>
+        <w:rPr>
+          <w:lang w:val="en-US"/>
+        </w:rPr>
+        <w:t xml:space="preserve">  - Bronze </w:t>
+      </w:r>
+      <w:r>
+        <w:rPr>
+          <w:rFonts w:ascii="Segoe UI Emoji" w:hAnsi="Segoe UI Emoji" w:cs="Segoe UI Emoji"/>
+          <w:lang w:val="en-US"/>
+        </w:rPr>
+        <w:t>✅</w:t>
+      </w:r>
+      <w:r>
+        <w:rPr>
+          <w:lang w:val="en-US"/>
+        </w:rPr>
+        <w:t xml:space="preserve"> </w:t>
+      </w:r>
+      <w:r>
+        <w:rPr>
+          <w:rFonts w:ascii="Aptos" w:hAnsi="Aptos" w:cs="Aptos"/>
+          <w:lang w:val="en-US"/>
+        </w:rPr>
+        <w:t>—</w:t>
+      </w:r>
+      <w:r>
+        <w:rPr>
+          <w:lang w:val="en-US"/>
+        </w:rPr>
+        <w:t xml:space="preserve"> </w:t>
+      </w:r>
+      <w:proofErr w:type="spellStart"/>
+      <w:r>
+        <w:rPr>
+          <w:lang w:val="en-US"/>
+        </w:rPr>
+        <w:t>b</w:t>
+      </w:r>
+      <w:r>
+        <w:rPr>
+          <w:rFonts w:ascii="Aptos" w:hAnsi="Aptos" w:cs="Aptos"/>
+          <w:lang w:val="en-US"/>
+        </w:rPr>
+        <w:t>å</w:t>
+      </w:r>
+      <w:r>
+        <w:rPr>
+          <w:lang w:val="en-US"/>
+        </w:rPr>
+        <w:t>da</w:t>
+      </w:r>
+      <w:proofErr w:type="spellEnd"/>
+      <w:r>
+        <w:rPr>
+          <w:lang w:val="en-US"/>
+        </w:rPr>
+        <w:t xml:space="preserve"> </w:t>
+      </w:r>
+      <w:proofErr w:type="spellStart"/>
+      <w:r>
+        <w:rPr>
+          <w:lang w:val="en-US"/>
+        </w:rPr>
+        <w:t>k</w:t>
+      </w:r>
+      <w:r>
+        <w:rPr>
+          <w:rFonts w:ascii="Aptos" w:hAnsi="Aptos" w:cs="Aptos"/>
+          <w:lang w:val="en-US"/>
+        </w:rPr>
+        <w:t>ä</w:t>
+      </w:r>
+      <w:r>
+        <w:rPr>
+          <w:lang w:val="en-US"/>
+        </w:rPr>
+        <w:t>llor</w:t>
+      </w:r>
+      <w:proofErr w:type="spellEnd"/>
+      <w:r>
+        <w:rPr>
+          <w:lang w:val="en-US"/>
+        </w:rPr>
+        <w:t xml:space="preserve"> </w:t>
+      </w:r>
+      <w:proofErr w:type="spellStart"/>
+      <w:r>
+        <w:rPr>
+          <w:lang w:val="en-US"/>
+        </w:rPr>
+        <w:t>laddade</w:t>
+      </w:r>
+      <w:proofErr w:type="spellEnd"/>
+    </w:p>
+    <w:p>
+      <w:pPr>
+        <w:rPr>
+          <w:lang w:val="en-US"/>
+        </w:rPr>
+      </w:pPr>
+      <w:r>
+        <w:rPr>
+          <w:lang w:val="en-US"/>
+        </w:rPr>
+        <w:t xml:space="preserve">  - Silver </w:t>
+      </w:r>
+      <w:r>
+        <w:rPr>
+          <w:rFonts w:ascii="Segoe UI Emoji" w:hAnsi="Segoe UI Emoji" w:cs="Segoe UI Emoji"/>
+          <w:lang w:val="en-US"/>
+        </w:rPr>
+        <w:t>✅</w:t>
+      </w:r>
+      <w:r>
+        <w:rPr>
+          <w:lang w:val="en-US"/>
+        </w:rPr>
+        <w:t xml:space="preserve"> </w:t>
+      </w:r>
+      <w:r>
+        <w:rPr>
+          <w:rFonts w:ascii="Aptos" w:hAnsi="Aptos" w:cs="Aptos"/>
+          <w:lang w:val="en-US"/>
+        </w:rPr>
+        <w:t>—</w:t>
+      </w:r>
+      <w:r>
+        <w:rPr>
+          <w:lang w:val="en-US"/>
+        </w:rPr>
+        <w:t xml:space="preserve"> Freshdesk och Linear </w:t>
+      </w:r>
+      <w:proofErr w:type="spellStart"/>
+      <w:r>
+        <w:rPr>
+          <w:lang w:val="en-US"/>
+        </w:rPr>
+        <w:t>k</w:t>
+      </w:r>
+      <w:r>
+        <w:rPr>
+          <w:rFonts w:ascii="Aptos" w:hAnsi="Aptos" w:cs="Aptos"/>
+          <w:lang w:val="en-US"/>
+        </w:rPr>
+        <w:t>ö</w:t>
+      </w:r>
+      <w:r>
+        <w:rPr>
+          <w:lang w:val="en-US"/>
+        </w:rPr>
+        <w:t>rda</w:t>
+      </w:r>
+      <w:proofErr w:type="spellEnd"/>
+      <w:r>
+        <w:rPr>
+          <w:lang w:val="en-US"/>
+        </w:rPr>
+        <w:t xml:space="preserve"> och </w:t>
+      </w:r>
+      <w:proofErr w:type="spellStart"/>
+      <w:r>
+        <w:rPr>
+          <w:lang w:val="en-US"/>
+        </w:rPr>
+        <w:t>verifierade</w:t>
+      </w:r>
+      <w:proofErr w:type="spellEnd"/>
+    </w:p>
+    <w:p>
+      <w:pPr>
+        <w:rPr>
+          <w:lang w:val="en-US"/>
+        </w:rPr>
+      </w:pPr>
+      <w:r>
+        <w:rPr>
+          <w:lang w:val="en-US"/>
+        </w:rPr>
+        <w:t xml:space="preserve">  - Gold </w:t>
+      </w:r>
+      <w:r>
+        <w:rPr>
+          <w:rFonts w:ascii="Segoe UI Emoji" w:hAnsi="Segoe UI Emoji" w:cs="Segoe UI Emoji"/>
+          <w:lang w:val="en-US"/>
+        </w:rPr>
+        <w:t>⏳</w:t>
+      </w:r>
+      <w:r>
+        <w:rPr>
+          <w:lang w:val="en-US"/>
+        </w:rPr>
+        <w:t xml:space="preserve"> </w:t>
+      </w:r>
+      <w:r>
+        <w:rPr>
+          <w:rFonts w:ascii="Aptos" w:hAnsi="Aptos" w:cs="Aptos"/>
+          <w:lang w:val="en-US"/>
+        </w:rPr>
+        <w:t>—</w:t>
+      </w:r>
+      <w:r>
+        <w:rPr>
+          <w:lang w:val="en-US"/>
+        </w:rPr>
+        <w:t xml:space="preserve"> </w:t>
+      </w:r>
+      <w:proofErr w:type="spellStart"/>
+      <w:r>
+        <w:rPr>
+          <w:lang w:val="en-US"/>
+        </w:rPr>
+        <w:t>n</w:t>
+      </w:r>
+      <w:r>
+        <w:rPr>
+          <w:rFonts w:ascii="Aptos" w:hAnsi="Aptos" w:cs="Aptos"/>
+          <w:lang w:val="en-US"/>
+        </w:rPr>
+        <w:t>ä</w:t>
+      </w:r>
+      <w:r>
+        <w:rPr>
+          <w:lang w:val="en-US"/>
+        </w:rPr>
+        <w:t>sta</w:t>
+      </w:r>
+      <w:proofErr w:type="spellEnd"/>
+      <w:r>
+        <w:rPr>
+          <w:lang w:val="en-US"/>
+        </w:rPr>
+        <w:t xml:space="preserve"> session</w:t>
+      </w:r>
+    </w:p>
+    <w:p>
+      <w:pPr>
+        <w:rPr>
+          <w:lang w:val="en-US"/>
+        </w:rPr>
+      </w:pPr>
+      <w:r>
+        <w:rPr>
+          <w:lang w:val="en-US"/>
+        </w:rPr>
+        <w:t xml:space="preserve">  - Power BI </w:t>
+      </w:r>
+      <w:r>
+        <w:rPr>
+          <w:rFonts w:ascii="Segoe UI Emoji" w:hAnsi="Segoe UI Emoji" w:cs="Segoe UI Emoji"/>
+          <w:lang w:val="en-US"/>
+        </w:rPr>
+        <w:t>⏳</w:t>
+      </w:r>
+      <w:r>
+        <w:rPr>
+          <w:lang w:val="en-US"/>
+        </w:rPr>
+        <w:t xml:space="preserve"> </w:t>
+      </w:r>
+      <w:r>
+        <w:rPr>
+          <w:rFonts w:ascii="Aptos" w:hAnsi="Aptos" w:cs="Aptos"/>
+          <w:lang w:val="en-US"/>
+        </w:rPr>
+        <w:t>—</w:t>
+      </w:r>
+      <w:r>
+        <w:rPr>
+          <w:lang w:val="en-US"/>
+        </w:rPr>
+        <w:t xml:space="preserve"> </w:t>
+      </w:r>
+      <w:proofErr w:type="spellStart"/>
+      <w:r>
+        <w:rPr>
+          <w:lang w:val="en-US"/>
+        </w:rPr>
+        <w:t>efter</w:t>
+      </w:r>
+      <w:proofErr w:type="spellEnd"/>
+      <w:r>
+        <w:rPr>
+          <w:lang w:val="en-US"/>
+        </w:rPr>
+        <w:t xml:space="preserve"> gold</w:t>
+      </w:r>
+    </w:p>
+    <w:p>
+      <w:pPr>
+        <w:rPr>
+          <w:lang w:val="en-US"/>
+        </w:rPr>
+      </w:pPr>
+      <w:r>
+        <w:rPr>
+          <w:lang w:val="en-US"/>
+        </w:rPr>
+        <w:t xml:space="preserve">Info </w:t>
+      </w:r>
+      <w:proofErr w:type="spellStart"/>
+      <w:r>
+        <w:rPr>
+          <w:lang w:val="en-US"/>
+        </w:rPr>
+        <w:t>finns</w:t>
+      </w:r>
+      <w:proofErr w:type="spellEnd"/>
+      <w:r>
+        <w:rPr>
+          <w:lang w:val="en-US"/>
+        </w:rPr>
+        <w:t xml:space="preserve"> </w:t>
+      </w:r>
+      <w:proofErr w:type="spellStart"/>
+      <w:r>
+        <w:rPr>
+          <w:lang w:val="en-US"/>
+        </w:rPr>
+        <w:t>i</w:t>
+      </w:r>
+      <w:proofErr w:type="spellEnd"/>
+      <w:r>
+        <w:rPr>
+          <w:lang w:val="en-US"/>
+        </w:rPr>
+        <w:t xml:space="preserve"> </w:t>
+      </w:r>
+      <w:r>
+        <w:rPr>
+          <w:lang w:val="en-US"/>
+        </w:rPr>
+        <w:t>CLAUDE.md</w:t>
+      </w:r>
+      <w:r>
+        <w:rPr>
+          <w:lang w:val="en-US"/>
+        </w:rPr>
+        <w:t>,</w:t>
+      </w:r>
+      <w:r>
+        <w:rPr>
+          <w:lang w:val="en-US"/>
+        </w:rPr>
+        <w:t xml:space="preserve"> README.md </w:t>
+      </w:r>
+      <w:r>
+        <w:rPr>
+          <w:lang w:val="en-US"/>
+        </w:rPr>
+        <w:t xml:space="preserve">och History.md </w:t>
+      </w:r>
+    </w:p>
+    <w:p>
+      <w:pPr>
+        <w:rPr>
+          <w:lang w:val="en-US"/>
+        </w:rPr>
+      </w:pPr>
+    </w:p>
     <w:p>
       <w:pPr>
         <w:rPr>
@@ -584,98 +985,305 @@
           <w:lang w:val="en-US"/>
         </w:rPr>
       </w:pPr>
-      <w:r>
-        <w:rPr>
-          <w:lang w:val="en-US"/>
-        </w:rPr>
-        <w:t>What SSMS gives you</w:t>
-      </w:r>
-    </w:p>
-    <w:p>
-      <w:pPr>
-        <w:rPr>
-          <w:lang w:val="en-US"/>
-        </w:rPr>
-      </w:pPr>
-      <w:r>
-        <w:rPr>
-          <w:lang w:val="en-US"/>
-        </w:rPr>
-        <w:t xml:space="preserve">  SSMS is just a client — the database engine is SQL Server. If you have SQL Server installed locally (Developer Edition</w:t>
-      </w:r>
-    </w:p>
-    <w:p>
-      <w:pPr>
-        <w:rPr>
-          <w:lang w:val="en-US"/>
-        </w:rPr>
-      </w:pPr>
-      <w:r>
-        <w:rPr>
-          <w:lang w:val="en-US"/>
-        </w:rPr>
-        <w:t xml:space="preserve">   is free and identical to Enterprise), you can build the full silver and gold layers there in T-SQL, and the exact</w:t>
-      </w:r>
-    </w:p>
-    <w:p>
-      <w:pPr>
-        <w:rPr>
-          <w:lang w:val="en-US"/>
-        </w:rPr>
-      </w:pPr>
-      <w:r>
-        <w:rPr>
-          <w:lang w:val="en-US"/>
-        </w:rPr>
-        <w:t xml:space="preserve">  same scripts will run on a real server later with zero changes. That's the right path.</w:t>
-      </w:r>
-    </w:p>
-    <w:p>
-      <w:pPr>
-        <w:rPr>
-          <w:lang w:val="en-US"/>
-        </w:rPr>
-      </w:pPr>
-    </w:p>
-    <w:p>
-      <w:pPr>
-        <w:rPr>
-          <w:lang w:val="en-US"/>
-        </w:rPr>
-      </w:pPr>
-      <w:r>
-        <w:rPr>
-          <w:lang w:val="en-US"/>
-        </w:rPr>
-        <w:t xml:space="preserve">  The recommended approach</w:t>
-      </w:r>
-    </w:p>
-    <w:p>
-      <w:pPr>
-        <w:rPr>
-          <w:lang w:val="en-US"/>
-        </w:rPr>
-      </w:pPr>
-    </w:p>
-    <w:p>
-      <w:pPr>
-        <w:rPr>
-          <w:lang w:val="en-US"/>
-        </w:rPr>
-      </w:pPr>
-      <w:r>
-        <w:rPr>
-          <w:lang w:val="en-US"/>
-        </w:rPr>
-        <w:t xml:space="preserve">  Three layers, one database, separate schemas:</w:t>
-      </w:r>
-    </w:p>
-    <w:p>
-      <w:pPr>
-        <w:rPr>
-          <w:lang w:val="en-US"/>
-        </w:rPr>
-      </w:pPr>
+    </w:p>
+    <w:p>
+      <w:pPr>
+        <w:rPr>
+          <w:lang w:val="en-US"/>
+        </w:rPr>
+      </w:pPr>
+      <w:r>
+        <w:rPr>
+          <w:lang w:val="en-US"/>
+        </w:rPr>
+        <w:br w:type="page"/>
+      </w:r>
+    </w:p>
+    <w:p>
+      <w:pPr>
+        <w:rPr>
+          <w:lang w:val="en-US"/>
+        </w:rPr>
+      </w:pPr>
+    </w:p>
+    <w:p>
+      <w:pPr>
+        <w:rPr>
+          <w:lang w:val="en-US"/>
+        </w:rPr>
+      </w:pPr>
+      <w:r>
+        <w:rPr>
+          <w:lang w:val="en-US"/>
+        </w:rPr>
+        <w:t xml:space="preserve">  Phase 4 — Silver layer (SSMS, after data is loaded)</w:t>
+      </w:r>
+    </w:p>
+    <w:p>
+      <w:pPr>
+        <w:rPr>
+          <w:lang w:val="en-US"/>
+        </w:rPr>
+      </w:pPr>
+      <w:r>
+        <w:rPr>
+          <w:lang w:val="en-US"/>
+        </w:rPr>
+        <w:t xml:space="preserve">  Views or tables on top of bronze: status/priority codes mapped to labels, timestamps converted to Europe/Stockholm,</w:t>
+      </w:r>
+    </w:p>
+    <w:p>
+      <w:pPr>
+        <w:rPr>
+          <w:lang w:val="en-US"/>
+        </w:rPr>
+      </w:pPr>
+      <w:r>
+        <w:rPr>
+          <w:lang w:val="en-US"/>
+        </w:rPr>
+        <w:t xml:space="preserve">  Freshdesk rows with </w:t>
+      </w:r>
+      <w:proofErr w:type="spellStart"/>
+      <w:r>
+        <w:rPr>
+          <w:lang w:val="en-US"/>
+        </w:rPr>
+        <w:t>group_id</w:t>
+      </w:r>
+      <w:proofErr w:type="spellEnd"/>
+      <w:r>
+        <w:rPr>
+          <w:lang w:val="en-US"/>
+        </w:rPr>
+        <w:t xml:space="preserve"> ending in 1939 or 8846 filtered out, Linear nested data tidied up.</w:t>
+      </w:r>
+    </w:p>
+    <w:p>
+      <w:pPr>
+        <w:rPr>
+          <w:lang w:val="en-US"/>
+        </w:rPr>
+      </w:pPr>
+    </w:p>
+    <w:p>
+      <w:pPr>
+        <w:rPr>
+          <w:lang w:val="en-US"/>
+        </w:rPr>
+      </w:pPr>
+      <w:r>
+        <w:rPr>
+          <w:lang w:val="en-US"/>
+        </w:rPr>
+        <w:t xml:space="preserve">  Phases 5–7 — Gold + Power BI, later.</w:t>
+      </w:r>
+    </w:p>
+    <w:p>
+      <w:pPr>
+        <w:rPr>
+          <w:lang w:val="en-US"/>
+        </w:rPr>
+      </w:pPr>
+    </w:p>
+    <w:p>
+      <w:pPr>
+        <w:rPr>
+          <w:lang w:val="en-US"/>
+        </w:rPr>
+      </w:pPr>
+      <w:r>
+        <w:rPr>
+          <w:lang w:val="en-US"/>
+        </w:rPr>
+        <w:t xml:space="preserve">  ---</w:t>
+      </w:r>
+    </w:p>
+    <w:p>
+      <w:pPr>
+        <w:rPr>
+          <w:lang w:val="en-US"/>
+        </w:rPr>
+      </w:pPr>
+      <w:r>
+        <w:rPr>
+          <w:lang w:val="en-US"/>
+        </w:rPr>
+        <w:t xml:space="preserve">  On the bronze design — append with import tracking is a solid choice. The tables will have:</w:t>
+      </w:r>
+    </w:p>
+    <w:p>
+      <w:pPr>
+        <w:rPr>
+          <w:lang w:val="en-US"/>
+        </w:rPr>
+      </w:pPr>
+      <w:r>
+        <w:rPr>
+          <w:lang w:val="en-US"/>
+        </w:rPr>
+        <w:t xml:space="preserve">  - A surrogate IDENTITY primary key (so each row is unique even if the same ticket appears in multiple snapshots)</w:t>
+      </w:r>
+    </w:p>
+    <w:p>
+      <w:pPr>
+        <w:rPr>
+          <w:lang w:val="en-US"/>
+        </w:rPr>
+      </w:pPr>
+      <w:r>
+        <w:rPr>
+          <w:lang w:val="en-US"/>
+        </w:rPr>
+        <w:t xml:space="preserve">  - _</w:t>
+      </w:r>
+      <w:proofErr w:type="spellStart"/>
+      <w:r>
+        <w:rPr>
+          <w:lang w:val="en-US"/>
+        </w:rPr>
+        <w:t>snapshot_file</w:t>
+      </w:r>
+      <w:proofErr w:type="spellEnd"/>
+      <w:r>
+        <w:rPr>
+          <w:lang w:val="en-US"/>
+        </w:rPr>
+        <w:t xml:space="preserve"> — the filename the row came from</w:t>
+      </w:r>
+    </w:p>
+    <w:p>
+      <w:pPr>
+        <w:rPr>
+          <w:lang w:val="en-US"/>
+        </w:rPr>
+      </w:pPr>
+      <w:r>
+        <w:rPr>
+          <w:lang w:val="en-US"/>
+        </w:rPr>
+        <w:t xml:space="preserve">  - _</w:t>
+      </w:r>
+      <w:proofErr w:type="spellStart"/>
+      <w:r>
+        <w:rPr>
+          <w:lang w:val="en-US"/>
+        </w:rPr>
+        <w:t>loaded_at</w:t>
+      </w:r>
+      <w:proofErr w:type="spellEnd"/>
+      <w:r>
+        <w:rPr>
+          <w:lang w:val="en-US"/>
+        </w:rPr>
+        <w:t xml:space="preserve"> — when it was inserted</w:t>
+      </w:r>
+    </w:p>
+    <w:p>
+      <w:pPr>
+        <w:rPr>
+          <w:lang w:val="en-US"/>
+        </w:rPr>
+      </w:pPr>
+    </w:p>
+    <w:p>
+      <w:pPr>
+        <w:rPr>
+          <w:lang w:val="en-US"/>
+        </w:rPr>
+      </w:pPr>
+      <w:r>
+        <w:rPr>
+          <w:lang w:val="en-US"/>
+        </w:rPr>
+        <w:t xml:space="preserve">  Plus a </w:t>
+      </w:r>
+      <w:proofErr w:type="spellStart"/>
+      <w:r>
+        <w:rPr>
+          <w:lang w:val="en-US"/>
+        </w:rPr>
+        <w:t>bronze.import_log</w:t>
+      </w:r>
+      <w:proofErr w:type="spellEnd"/>
+      <w:r>
+        <w:rPr>
+          <w:lang w:val="en-US"/>
+        </w:rPr>
+        <w:t xml:space="preserve"> table that records which files have been loaded, so the Python loader can skip files already</w:t>
+      </w:r>
+    </w:p>
+    <w:p>
+      <w:pPr>
+        <w:rPr>
+          <w:lang w:val="en-US"/>
+        </w:rPr>
+      </w:pPr>
+      <w:r>
+        <w:rPr>
+          <w:lang w:val="en-US"/>
+        </w:rPr>
+        <w:t xml:space="preserve">  processed.</w:t>
+      </w:r>
+    </w:p>
+    <w:p>
+      <w:pPr>
+        <w:rPr>
+          <w:lang w:val="en-US"/>
+        </w:rPr>
+      </w:pPr>
+      <w:r>
+        <w:rPr>
+          <w:lang w:val="en-US"/>
+        </w:rPr>
+        <w:br w:type="page"/>
+      </w:r>
+    </w:p>
+    <w:p>
+      <w:pPr>
+        <w:rPr>
+          <w:lang w:val="en-US"/>
+        </w:rPr>
+      </w:pPr>
+      <w:r>
+        <w:rPr>
+          <w:lang w:val="en-US"/>
+        </w:rPr>
+        <w:t>1. Run 04_silver_create_tables_freshdesk.sql first (only needed once — creates the table).</w:t>
+      </w:r>
+    </w:p>
+    <w:p>
+      <w:pPr>
+        <w:rPr>
+          <w:lang w:val="en-US"/>
+        </w:rPr>
+      </w:pPr>
+      <w:r>
+        <w:rPr>
+          <w:lang w:val="en-US"/>
+        </w:rPr>
+        <w:t xml:space="preserve">  2. Run 05_silver_load_freshdesk.sql to populate it — and again after every bronze load.</w:t>
+      </w:r>
+    </w:p>
+    <w:p>
+      <w:pPr>
+        <w:rPr>
+          <w:lang w:val="en-US"/>
+        </w:rPr>
+      </w:pPr>
+    </w:p>
+    <w:p>
+      <w:pPr>
+        <w:rPr>
+          <w:lang w:val="en-US"/>
+        </w:rPr>
+      </w:pPr>
+      <w:r>
+        <w:rPr>
+          <w:lang w:val="en-US"/>
+        </w:rPr>
+        <w:t xml:space="preserve">  The load script will print something like:</w:t>
+      </w:r>
     </w:p>
     <w:p>
       <w:pPr>
@@ -694,877 +1302,130 @@
         <w:rPr>
           <w:lang w:val="en-US"/>
         </w:rPr>
-        <w:t>StatistikFD_Linear</w:t>
-      </w:r>
-      <w:proofErr w:type="spellEnd"/>
-      <w:r>
-        <w:rPr>
-          <w:lang w:val="en-US"/>
-        </w:rPr>
-        <w:t xml:space="preserve"> (database)</w:t>
-      </w:r>
-    </w:p>
-    <w:p>
-      <w:pPr>
-        <w:rPr>
-          <w:lang w:val="en-US"/>
-        </w:rPr>
-      </w:pPr>
-      <w:r>
-        <w:rPr>
-          <w:lang w:val="en-US"/>
-        </w:rPr>
-        <w:t xml:space="preserve">  </w:t>
-      </w:r>
-      <w:r>
-        <w:rPr>
-          <w:rFonts w:ascii="MS Gothic" w:eastAsia="MS Gothic" w:hAnsi="MS Gothic" w:cs="MS Gothic" w:hint="eastAsia"/>
-          <w:lang w:val="en-US"/>
-        </w:rPr>
-        <w:t>├</w:t>
-      </w:r>
-      <w:r>
-        <w:rPr>
-          <w:rFonts w:ascii="Aptos" w:hAnsi="Aptos" w:cs="Aptos"/>
-          <w:lang w:val="en-US"/>
-        </w:rPr>
-        <w:t>──</w:t>
-      </w:r>
-      <w:r>
-        <w:rPr>
-          <w:lang w:val="en-US"/>
-        </w:rPr>
-        <w:t xml:space="preserve"> bronze    </w:t>
-      </w:r>
-      <w:r>
-        <w:rPr>
-          <w:rFonts w:ascii="Aptos" w:hAnsi="Aptos" w:cs="Aptos"/>
-          <w:lang w:val="en-US"/>
-        </w:rPr>
-        <w:t>←</w:t>
-      </w:r>
-      <w:r>
-        <w:rPr>
-          <w:lang w:val="en-US"/>
-        </w:rPr>
-        <w:t xml:space="preserve"> raw JSON loaded into tables</w:t>
-      </w:r>
-    </w:p>
-    <w:p>
-      <w:pPr>
-        <w:rPr>
-          <w:lang w:val="en-US"/>
-        </w:rPr>
-      </w:pPr>
-      <w:r>
-        <w:rPr>
-          <w:lang w:val="en-US"/>
-        </w:rPr>
-        <w:t xml:space="preserve">  </w:t>
-      </w:r>
-      <w:r>
-        <w:rPr>
-          <w:rFonts w:ascii="MS Gothic" w:eastAsia="MS Gothic" w:hAnsi="MS Gothic" w:cs="MS Gothic" w:hint="eastAsia"/>
-          <w:lang w:val="en-US"/>
-        </w:rPr>
-        <w:t>├</w:t>
-      </w:r>
-      <w:r>
-        <w:rPr>
-          <w:rFonts w:ascii="Aptos" w:hAnsi="Aptos" w:cs="Aptos"/>
-          <w:lang w:val="en-US"/>
-        </w:rPr>
-        <w:t>──</w:t>
-      </w:r>
-      <w:r>
-        <w:rPr>
-          <w:lang w:val="en-US"/>
-        </w:rPr>
-        <w:t xml:space="preserve"> silver    </w:t>
-      </w:r>
-      <w:r>
-        <w:rPr>
-          <w:rFonts w:ascii="Aptos" w:hAnsi="Aptos" w:cs="Aptos"/>
-          <w:lang w:val="en-US"/>
-        </w:rPr>
-        <w:t>←</w:t>
-      </w:r>
-      <w:r>
-        <w:rPr>
-          <w:lang w:val="en-US"/>
-        </w:rPr>
-        <w:t xml:space="preserve"> cleaned, normalized, filtered</w:t>
-      </w:r>
-    </w:p>
-    <w:p>
-      <w:pPr>
-        <w:rPr>
-          <w:lang w:val="en-US"/>
-        </w:rPr>
-      </w:pPr>
-      <w:r>
-        <w:rPr>
-          <w:lang w:val="en-US"/>
-        </w:rPr>
-        <w:t xml:space="preserve">  └── gold      ← star schema for Power BI</w:t>
-      </w:r>
-    </w:p>
-    <w:p>
-      <w:pPr>
-        <w:rPr>
-          <w:lang w:val="en-US"/>
-        </w:rPr>
-      </w:pPr>
-    </w:p>
-    <w:p>
-      <w:pPr>
-        <w:rPr>
-          <w:lang w:val="en-US"/>
-        </w:rPr>
-      </w:pPr>
-      <w:r>
-        <w:rPr>
-          <w:lang w:val="en-US"/>
-        </w:rPr>
-        <w:t xml:space="preserve">  For loading JSON → SQL Server, don't use the SSMS import wizard — it's manual and not repeatable. Instead, write a</w:t>
-      </w:r>
-    </w:p>
-    <w:p>
-      <w:pPr>
-        <w:rPr>
-          <w:lang w:val="en-US"/>
-        </w:rPr>
-      </w:pPr>
-      <w:r>
-        <w:rPr>
-          <w:lang w:val="en-US"/>
-        </w:rPr>
-        <w:t xml:space="preserve">  small Python loader script (similar to the snapshot scripts) that reads the JSON files and </w:t>
-      </w:r>
-      <w:proofErr w:type="spellStart"/>
-      <w:r>
-        <w:rPr>
-          <w:lang w:val="en-US"/>
-        </w:rPr>
-        <w:t>upserts</w:t>
-      </w:r>
-      <w:proofErr w:type="spellEnd"/>
-      <w:r>
-        <w:rPr>
-          <w:lang w:val="en-US"/>
-        </w:rPr>
-        <w:t xml:space="preserve"> into the bronze</w:t>
-      </w:r>
-    </w:p>
-    <w:p>
-      <w:pPr>
-        <w:rPr>
-          <w:lang w:val="en-US"/>
-        </w:rPr>
-      </w:pPr>
-      <w:r>
-        <w:rPr>
-          <w:lang w:val="en-US"/>
-        </w:rPr>
-        <w:t xml:space="preserve">  tables using </w:t>
-      </w:r>
-      <w:proofErr w:type="spellStart"/>
-      <w:r>
-        <w:rPr>
-          <w:lang w:val="en-US"/>
-        </w:rPr>
-        <w:t>pyodbc</w:t>
-      </w:r>
-      <w:proofErr w:type="spellEnd"/>
-      <w:r>
-        <w:rPr>
-          <w:lang w:val="en-US"/>
-        </w:rPr>
-        <w:t>. This means:</w:t>
-      </w:r>
-    </w:p>
-    <w:p>
-      <w:pPr>
-        <w:rPr>
-          <w:lang w:val="en-US"/>
-        </w:rPr>
-      </w:pPr>
-      <w:r>
-        <w:rPr>
-          <w:lang w:val="en-US"/>
-        </w:rPr>
-        <w:t xml:space="preserve">  - It runs locally now pointing at localhost</w:t>
-      </w:r>
-    </w:p>
-    <w:p>
-      <w:pPr>
-        <w:rPr>
-          <w:lang w:val="en-US"/>
-        </w:rPr>
-      </w:pPr>
-      <w:r>
-        <w:rPr>
-          <w:lang w:val="en-US"/>
-        </w:rPr>
-        <w:t xml:space="preserve">  - It runs on GitHub Actions later with a connection string secret pointing at the server</w:t>
-      </w:r>
-    </w:p>
-    <w:p>
-      <w:pPr>
-        <w:rPr>
-          <w:lang w:val="en-US"/>
-        </w:rPr>
-      </w:pPr>
-      <w:r>
-        <w:rPr>
-          <w:lang w:val="en-US"/>
-        </w:rPr>
-        <w:t xml:space="preserve">  - No manual steps ever</w:t>
-      </w:r>
-    </w:p>
-    <w:p>
-      <w:pPr>
-        <w:rPr>
-          <w:lang w:val="en-US"/>
-        </w:rPr>
-      </w:pPr>
-    </w:p>
-    <w:p>
-      <w:pPr>
-        <w:rPr>
-          <w:lang w:val="en-US"/>
-        </w:rPr>
-      </w:pPr>
-      <w:r>
-        <w:rPr>
-          <w:lang w:val="en-US"/>
-        </w:rPr>
-        <w:t xml:space="preserve">  1. SQL Server Developer Edition installed locally (not just SSMS)</w:t>
-      </w:r>
-    </w:p>
-    <w:p>
-      <w:pPr>
-        <w:rPr>
-          <w:lang w:val="en-US"/>
-        </w:rPr>
-      </w:pPr>
-      <w:r>
-        <w:rPr>
-          <w:lang w:val="en-US"/>
-        </w:rPr>
-        <w:t xml:space="preserve">  2. Create the database and three schemas in SSMS</w:t>
-      </w:r>
-    </w:p>
-    <w:p>
-      <w:pPr>
-        <w:rPr>
-          <w:lang w:val="en-US"/>
-        </w:rPr>
-      </w:pPr>
-      <w:r>
-        <w:rPr>
-          <w:lang w:val="en-US"/>
-        </w:rPr>
-        <w:t xml:space="preserve">  3. Design and create the bronze tables (</w:t>
-      </w:r>
-      <w:proofErr w:type="spellStart"/>
-      <w:r>
-        <w:rPr>
-          <w:lang w:val="en-US"/>
-        </w:rPr>
-        <w:t>bronze.freshdesk_tickets</w:t>
-      </w:r>
-      <w:proofErr w:type="spellEnd"/>
-      <w:r>
-        <w:rPr>
-          <w:lang w:val="en-US"/>
-        </w:rPr>
-        <w:t xml:space="preserve">, </w:t>
-      </w:r>
-      <w:proofErr w:type="spellStart"/>
-      <w:r>
-        <w:rPr>
-          <w:lang w:val="en-US"/>
-        </w:rPr>
-        <w:t>bronze.linear_issues</w:t>
-      </w:r>
-      <w:proofErr w:type="spellEnd"/>
-      <w:r>
-        <w:rPr>
-          <w:lang w:val="en-US"/>
-        </w:rPr>
-        <w:t>)</w:t>
-      </w:r>
-    </w:p>
-    <w:p>
-      <w:pPr>
-        <w:rPr>
-          <w:lang w:val="en-US"/>
-        </w:rPr>
-      </w:pPr>
-      <w:r>
-        <w:rPr>
-          <w:lang w:val="en-US"/>
-        </w:rPr>
-        <w:t xml:space="preserve">  4. Write the Python JSON loader with </w:t>
-      </w:r>
-      <w:proofErr w:type="spellStart"/>
-      <w:r>
-        <w:rPr>
-          <w:lang w:val="en-US"/>
-        </w:rPr>
-        <w:t>upsert</w:t>
-      </w:r>
-      <w:proofErr w:type="spellEnd"/>
-      <w:r>
-        <w:rPr>
-          <w:lang w:val="en-US"/>
-        </w:rPr>
-        <w:t xml:space="preserve"> logic</w:t>
-      </w:r>
-    </w:p>
-    <w:p>
-      <w:pPr>
-        <w:rPr>
-          <w:lang w:val="en-US"/>
-        </w:rPr>
-      </w:pPr>
-      <w:r>
-        <w:rPr>
-          <w:lang w:val="en-US"/>
-        </w:rPr>
-        <w:t xml:space="preserve">  5. Build silver views/tables in T-SQL (filters, label mapping, deduplication)</w:t>
-      </w:r>
-    </w:p>
-    <w:p>
-      <w:pPr>
-        <w:rPr>
-          <w:lang w:val="en-US"/>
-        </w:rPr>
-      </w:pPr>
-      <w:r>
-        <w:rPr>
-          <w:lang w:val="en-US"/>
-        </w:rPr>
-        <w:t xml:space="preserve">  6. Build gold star schema in T-SQL</w:t>
-      </w:r>
-    </w:p>
-    <w:p>
-      <w:pPr>
-        <w:rPr>
-          <w:lang w:val="en-US"/>
-        </w:rPr>
-      </w:pPr>
-      <w:r>
-        <w:rPr>
-          <w:lang w:val="en-US"/>
-        </w:rPr>
-        <w:t xml:space="preserve">  7. Connect Power BI</w:t>
-      </w:r>
-    </w:p>
-    <w:p>
-      <w:pPr>
-        <w:rPr>
-          <w:lang w:val="en-US"/>
-        </w:rPr>
-      </w:pPr>
-      <w:r>
-        <w:rPr>
-          <w:lang w:val="en-US"/>
-        </w:rPr>
-        <w:br w:type="page"/>
-      </w:r>
-    </w:p>
-    <w:p>
-      <w:pPr>
-        <w:rPr>
-          <w:lang w:val="en-US"/>
-        </w:rPr>
-      </w:pPr>
-      <w:r>
-        <w:rPr>
-          <w:lang w:val="en-US"/>
-        </w:rPr>
-        <w:t xml:space="preserve">  Phase 1 — Setup (SSMS, ~5 minutes)</w:t>
-      </w:r>
-    </w:p>
-    <w:p>
-      <w:pPr>
-        <w:rPr>
-          <w:lang w:val="en-US"/>
-        </w:rPr>
-      </w:pPr>
-      <w:r>
-        <w:rPr>
-          <w:lang w:val="en-US"/>
-        </w:rPr>
-        <w:t xml:space="preserve">  Create the database and three schemas. Nothing else yet.</w:t>
-      </w:r>
-    </w:p>
-    <w:p>
-      <w:pPr>
-        <w:rPr>
-          <w:lang w:val="en-US"/>
-        </w:rPr>
-      </w:pPr>
-    </w:p>
-    <w:p>
-      <w:pPr>
-        <w:rPr>
-          <w:lang w:val="en-US"/>
-        </w:rPr>
-      </w:pPr>
-      <w:r>
-        <w:rPr>
-          <w:lang w:val="en-US"/>
-        </w:rPr>
-        <w:t xml:space="preserve">  Phase 2 — Bronze tables (SSMS)</w:t>
-      </w:r>
-    </w:p>
-    <w:p>
-      <w:pPr>
-        <w:rPr>
-          <w:lang w:val="en-US"/>
-        </w:rPr>
-      </w:pPr>
-      <w:r>
-        <w:rPr>
-          <w:lang w:val="en-US"/>
-        </w:rPr>
-        <w:t xml:space="preserve">  Two tables: </w:t>
-      </w:r>
-      <w:proofErr w:type="spellStart"/>
-      <w:r>
-        <w:rPr>
-          <w:lang w:val="en-US"/>
-        </w:rPr>
-        <w:t>bronze.freshdesk_tickets</w:t>
-      </w:r>
-      <w:proofErr w:type="spellEnd"/>
-      <w:r>
-        <w:rPr>
-          <w:lang w:val="en-US"/>
-        </w:rPr>
-        <w:t xml:space="preserve"> and </w:t>
-      </w:r>
-      <w:proofErr w:type="spellStart"/>
-      <w:r>
-        <w:rPr>
-          <w:lang w:val="en-US"/>
-        </w:rPr>
-        <w:t>bronze.linear_issues</w:t>
-      </w:r>
-      <w:proofErr w:type="spellEnd"/>
-      <w:r>
-        <w:rPr>
-          <w:lang w:val="en-US"/>
-        </w:rPr>
-        <w:t>. Typed SQL columns, nested JSON objects flattened (e.g.</w:t>
-      </w:r>
-    </w:p>
-    <w:p>
-      <w:pPr>
-        <w:rPr>
-          <w:lang w:val="en-US"/>
-        </w:rPr>
-      </w:pPr>
-      <w:r>
-        <w:rPr>
-          <w:lang w:val="en-US"/>
-        </w:rPr>
-        <w:t xml:space="preserve">  </w:t>
-      </w:r>
-      <w:proofErr w:type="spellStart"/>
-      <w:r>
-        <w:rPr>
-          <w:lang w:val="en-US"/>
-        </w:rPr>
-        <w:t>state_id</w:t>
-      </w:r>
-      <w:proofErr w:type="spellEnd"/>
-      <w:r>
-        <w:rPr>
-          <w:lang w:val="en-US"/>
-        </w:rPr>
-        <w:t xml:space="preserve">, </w:t>
-      </w:r>
-      <w:proofErr w:type="spellStart"/>
-      <w:r>
-        <w:rPr>
-          <w:lang w:val="en-US"/>
-        </w:rPr>
-        <w:t>state_name</w:t>
-      </w:r>
-      <w:proofErr w:type="spellEnd"/>
-      <w:r>
-        <w:rPr>
-          <w:lang w:val="en-US"/>
-        </w:rPr>
-        <w:t xml:space="preserve">). One row per ID — </w:t>
-      </w:r>
-      <w:proofErr w:type="spellStart"/>
-      <w:r>
-        <w:rPr>
-          <w:lang w:val="en-US"/>
-        </w:rPr>
-        <w:t>upsert</w:t>
-      </w:r>
-      <w:proofErr w:type="spellEnd"/>
-      <w:r>
-        <w:rPr>
-          <w:lang w:val="en-US"/>
-        </w:rPr>
-        <w:t xml:space="preserve"> on load, so re-loading the same snapshot doesn't duplicate data. Two</w:t>
-      </w:r>
-    </w:p>
-    <w:p>
-      <w:pPr>
-        <w:rPr>
-          <w:lang w:val="en-US"/>
-        </w:rPr>
-      </w:pPr>
-      <w:r>
-        <w:rPr>
-          <w:lang w:val="en-US"/>
-        </w:rPr>
-        <w:t xml:space="preserve">  audit columns on every table: _</w:t>
-      </w:r>
-      <w:proofErr w:type="spellStart"/>
-      <w:r>
-        <w:rPr>
-          <w:lang w:val="en-US"/>
-        </w:rPr>
-        <w:t>snapshot_ts</w:t>
-      </w:r>
-      <w:proofErr w:type="spellEnd"/>
-      <w:r>
-        <w:rPr>
-          <w:lang w:val="en-US"/>
-        </w:rPr>
-        <w:t xml:space="preserve"> (which file the data came from) and _</w:t>
-      </w:r>
-      <w:proofErr w:type="spellStart"/>
-      <w:r>
-        <w:rPr>
-          <w:lang w:val="en-US"/>
-        </w:rPr>
-        <w:t>loaded_at</w:t>
-      </w:r>
-      <w:proofErr w:type="spellEnd"/>
-      <w:r>
-        <w:rPr>
-          <w:lang w:val="en-US"/>
-        </w:rPr>
-        <w:t xml:space="preserve"> (when it was inserted).</w:t>
-      </w:r>
-    </w:p>
-    <w:p>
-      <w:pPr>
-        <w:rPr>
-          <w:lang w:val="en-US"/>
-        </w:rPr>
-      </w:pPr>
-    </w:p>
-    <w:p>
-      <w:pPr>
-        <w:rPr>
-          <w:lang w:val="en-US"/>
-        </w:rPr>
-      </w:pPr>
-      <w:r>
-        <w:rPr>
-          <w:lang w:val="en-US"/>
-        </w:rPr>
-        <w:t xml:space="preserve">  Phase 3 — Python loader (new script in the repo)</w:t>
-      </w:r>
-    </w:p>
-    <w:p>
-      <w:pPr>
-        <w:rPr>
-          <w:lang w:val="en-US"/>
-        </w:rPr>
-      </w:pPr>
-      <w:r>
-        <w:rPr>
-          <w:lang w:val="en-US"/>
-        </w:rPr>
-        <w:t xml:space="preserve">  Reads the JSON files from raw/, </w:t>
-      </w:r>
-      <w:proofErr w:type="spellStart"/>
-      <w:r>
-        <w:rPr>
-          <w:lang w:val="en-US"/>
-        </w:rPr>
-        <w:t>upserts</w:t>
-      </w:r>
-      <w:proofErr w:type="spellEnd"/>
-      <w:r>
-        <w:rPr>
-          <w:lang w:val="en-US"/>
-        </w:rPr>
-        <w:t xml:space="preserve"> into the bronze tables via </w:t>
-      </w:r>
-      <w:proofErr w:type="spellStart"/>
-      <w:r>
-        <w:rPr>
-          <w:lang w:val="en-US"/>
-        </w:rPr>
-        <w:t>pyodbc</w:t>
-      </w:r>
-      <w:proofErr w:type="spellEnd"/>
-      <w:r>
-        <w:rPr>
-          <w:lang w:val="en-US"/>
-        </w:rPr>
-        <w:t>. Connection string read from an env var or</w:t>
-      </w:r>
-    </w:p>
-    <w:p>
-      <w:pPr>
-        <w:rPr>
-          <w:lang w:val="en-US"/>
-        </w:rPr>
-      </w:pPr>
-      <w:r>
-        <w:rPr>
-          <w:lang w:val="en-US"/>
-        </w:rPr>
-        <w:t xml:space="preserve">  credentials file — same pattern as the snapshot scripts. Can run locally now, on GitHub Actions later with a secret.</w:t>
-      </w:r>
-    </w:p>
-    <w:p>
-      <w:pPr>
-        <w:rPr>
-          <w:lang w:val="en-US"/>
-        </w:rPr>
-      </w:pPr>
-    </w:p>
-    <w:p>
-      <w:pPr>
-        <w:rPr>
-          <w:lang w:val="en-US"/>
-        </w:rPr>
-      </w:pPr>
-      <w:r>
-        <w:rPr>
-          <w:lang w:val="en-US"/>
-        </w:rPr>
-        <w:t xml:space="preserve">  Phase 4 — Silver layer (SSMS, after data is loaded)</w:t>
-      </w:r>
-    </w:p>
-    <w:p>
-      <w:pPr>
-        <w:rPr>
-          <w:lang w:val="en-US"/>
-        </w:rPr>
-      </w:pPr>
-      <w:r>
-        <w:rPr>
-          <w:lang w:val="en-US"/>
-        </w:rPr>
-        <w:t xml:space="preserve">  Views or tables on top of bronze: status/priority codes mapped to labels, timestamps converted to Europe/Stockholm,</w:t>
-      </w:r>
-    </w:p>
-    <w:p>
-      <w:pPr>
-        <w:rPr>
-          <w:lang w:val="en-US"/>
-        </w:rPr>
-      </w:pPr>
-      <w:r>
-        <w:rPr>
-          <w:lang w:val="en-US"/>
-        </w:rPr>
-        <w:t xml:space="preserve">  Freshdesk rows with </w:t>
-      </w:r>
-      <w:proofErr w:type="spellStart"/>
-      <w:r>
-        <w:rPr>
-          <w:lang w:val="en-US"/>
-        </w:rPr>
-        <w:t>group_id</w:t>
-      </w:r>
-      <w:proofErr w:type="spellEnd"/>
-      <w:r>
-        <w:rPr>
-          <w:lang w:val="en-US"/>
-        </w:rPr>
-        <w:t xml:space="preserve"> ending in 1939 or 8846 filtered out, Linear nested data tidied up.</w:t>
-      </w:r>
-    </w:p>
-    <w:p>
-      <w:pPr>
-        <w:rPr>
-          <w:lang w:val="en-US"/>
-        </w:rPr>
-      </w:pPr>
-    </w:p>
-    <w:p>
-      <w:pPr>
-        <w:rPr>
-          <w:lang w:val="en-US"/>
-        </w:rPr>
-      </w:pPr>
-      <w:r>
-        <w:rPr>
-          <w:lang w:val="en-US"/>
-        </w:rPr>
-        <w:t xml:space="preserve">  Phases 5–7 — Gold + Power BI, later.</w:t>
-      </w:r>
-    </w:p>
-    <w:p>
-      <w:pPr>
-        <w:rPr>
-          <w:lang w:val="en-US"/>
-        </w:rPr>
-      </w:pPr>
-    </w:p>
-    <w:p>
-      <w:pPr>
-        <w:rPr>
-          <w:lang w:val="en-US"/>
-        </w:rPr>
-      </w:pPr>
-      <w:r>
-        <w:rPr>
-          <w:lang w:val="en-US"/>
-        </w:rPr>
-        <w:t xml:space="preserve">  ---</w:t>
-      </w:r>
-    </w:p>
-    <w:p>
-      <w:pPr>
-        <w:rPr>
-          <w:lang w:val="en-US"/>
-        </w:rPr>
-      </w:pPr>
-      <w:r>
-        <w:rPr>
-          <w:lang w:val="en-US"/>
-        </w:rPr>
-        <w:t xml:space="preserve">  On the bronze design — append with import tracking is a solid choice. The tables will have:</w:t>
-      </w:r>
-    </w:p>
-    <w:p>
-      <w:pPr>
-        <w:rPr>
-          <w:lang w:val="en-US"/>
-        </w:rPr>
-      </w:pPr>
-      <w:r>
-        <w:rPr>
-          <w:lang w:val="en-US"/>
-        </w:rPr>
-        <w:t xml:space="preserve">  - A surrogate IDENTITY primary key (so each row is unique even if the same ticket appears in multiple snapshots)</w:t>
-      </w:r>
-    </w:p>
-    <w:p>
-      <w:pPr>
-        <w:rPr>
-          <w:lang w:val="en-US"/>
-        </w:rPr>
-      </w:pPr>
-      <w:r>
-        <w:rPr>
-          <w:lang w:val="en-US"/>
-        </w:rPr>
-        <w:t xml:space="preserve">  - _</w:t>
-      </w:r>
-      <w:proofErr w:type="spellStart"/>
-      <w:r>
-        <w:rPr>
-          <w:lang w:val="en-US"/>
-        </w:rPr>
-        <w:t>snapshot_file</w:t>
-      </w:r>
-      <w:proofErr w:type="spellEnd"/>
-      <w:r>
-        <w:rPr>
-          <w:lang w:val="en-US"/>
-        </w:rPr>
-        <w:t xml:space="preserve"> — the filename the row came from</w:t>
-      </w:r>
-    </w:p>
-    <w:p>
-      <w:pPr>
-        <w:rPr>
-          <w:lang w:val="en-US"/>
-        </w:rPr>
-      </w:pPr>
-      <w:r>
-        <w:rPr>
-          <w:lang w:val="en-US"/>
-        </w:rPr>
-        <w:t xml:space="preserve">  - _</w:t>
-      </w:r>
-      <w:proofErr w:type="spellStart"/>
-      <w:r>
-        <w:rPr>
-          <w:lang w:val="en-US"/>
-        </w:rPr>
-        <w:t>loaded_at</w:t>
-      </w:r>
-      <w:proofErr w:type="spellEnd"/>
-      <w:r>
-        <w:rPr>
-          <w:lang w:val="en-US"/>
-        </w:rPr>
-        <w:t xml:space="preserve"> — when it was inserted</w:t>
-      </w:r>
-    </w:p>
-    <w:p>
-      <w:pPr>
-        <w:rPr>
-          <w:lang w:val="en-US"/>
-        </w:rPr>
-      </w:pPr>
-    </w:p>
-    <w:p>
-      <w:pPr>
-        <w:rPr>
-          <w:lang w:val="en-US"/>
-        </w:rPr>
-      </w:pPr>
-      <w:r>
-        <w:rPr>
-          <w:lang w:val="en-US"/>
-        </w:rPr>
-        <w:t xml:space="preserve">  Plus a </w:t>
-      </w:r>
-      <w:proofErr w:type="spellStart"/>
-      <w:r>
-        <w:rPr>
-          <w:lang w:val="en-US"/>
-        </w:rPr>
-        <w:t>bronze.import_log</w:t>
-      </w:r>
-      <w:proofErr w:type="spellEnd"/>
-      <w:r>
-        <w:rPr>
-          <w:lang w:val="en-US"/>
-        </w:rPr>
-        <w:t xml:space="preserve"> table that records which files have been loaded, so the Python loader can skip files already</w:t>
-      </w:r>
-    </w:p>
-    <w:p>
-      <w:pPr>
-        <w:rPr>
-          <w:lang w:val="en-US"/>
-        </w:rPr>
-      </w:pPr>
-      <w:r>
-        <w:rPr>
-          <w:lang w:val="en-US"/>
-        </w:rPr>
-        <w:t xml:space="preserve">  processed.</w:t>
-      </w:r>
-    </w:p>
-    <w:p>
-      <w:pPr>
-        <w:rPr>
-          <w:lang w:val="en-US"/>
-        </w:rPr>
-      </w:pPr>
+        <w:t>Klart</w:t>
+      </w:r>
+      <w:proofErr w:type="spellEnd"/>
+      <w:r>
+        <w:rPr>
+          <w:lang w:val="en-US"/>
+        </w:rPr>
+        <w:t>.</w:t>
+      </w:r>
+    </w:p>
+    <w:p>
+      <w:pPr>
+        <w:rPr>
+          <w:lang w:val="en-US"/>
+        </w:rPr>
+      </w:pPr>
+      <w:r>
+        <w:rPr>
+          <w:lang w:val="en-US"/>
+        </w:rPr>
+        <w:t xml:space="preserve">    </w:t>
+      </w:r>
+      <w:proofErr w:type="spellStart"/>
+      <w:r>
+        <w:rPr>
+          <w:lang w:val="en-US"/>
+        </w:rPr>
+        <w:t>Totalt</w:t>
+      </w:r>
+      <w:proofErr w:type="spellEnd"/>
+      <w:r>
+        <w:rPr>
+          <w:lang w:val="en-US"/>
+        </w:rPr>
+        <w:t xml:space="preserve"> </w:t>
+      </w:r>
+      <w:proofErr w:type="spellStart"/>
+      <w:r>
+        <w:rPr>
+          <w:lang w:val="en-US"/>
+        </w:rPr>
+        <w:t>laddade</w:t>
+      </w:r>
+      <w:proofErr w:type="spellEnd"/>
+      <w:r>
+        <w:rPr>
+          <w:lang w:val="en-US"/>
+        </w:rPr>
+        <w:t xml:space="preserve"> </w:t>
+      </w:r>
+      <w:proofErr w:type="spellStart"/>
+      <w:r>
+        <w:rPr>
+          <w:lang w:val="en-US"/>
+        </w:rPr>
+        <w:t>rader</w:t>
+      </w:r>
+      <w:proofErr w:type="spellEnd"/>
+      <w:r>
+        <w:rPr>
+          <w:lang w:val="en-US"/>
+        </w:rPr>
+        <w:t xml:space="preserve"> : 12543</w:t>
+      </w:r>
+    </w:p>
+    <w:p>
+      <w:pPr>
+        <w:rPr>
+          <w:lang w:val="en-US"/>
+        </w:rPr>
+      </w:pPr>
+      <w:r>
+        <w:rPr>
+          <w:lang w:val="en-US"/>
+        </w:rPr>
+        <w:t xml:space="preserve">    Varav </w:t>
+      </w:r>
+      <w:proofErr w:type="spellStart"/>
+      <w:r>
+        <w:rPr>
+          <w:lang w:val="en-US"/>
+        </w:rPr>
+        <w:t>denied_triage</w:t>
+      </w:r>
+      <w:proofErr w:type="spellEnd"/>
+      <w:r>
+        <w:rPr>
+          <w:lang w:val="en-US"/>
+        </w:rPr>
+        <w:t xml:space="preserve">  : 47</w:t>
+      </w:r>
+    </w:p>
+    <w:p>
+      <w:pPr>
+        <w:rPr>
+          <w:lang w:val="en-US"/>
+        </w:rPr>
+      </w:pPr>
+    </w:p>
+    <w:p>
+      <w:pPr>
+        <w:rPr>
+          <w:lang w:val="en-US"/>
+        </w:rPr>
+      </w:pPr>
+      <w:r>
+        <w:rPr>
+          <w:lang w:val="en-US"/>
+        </w:rPr>
+        <w:t xml:space="preserve">  When you're ready, the next step is the Linear silver table. That one adds a filter on identifier NOT LIKE 'DEV%' and</w:t>
+      </w:r>
+    </w:p>
+    <w:p>
+      <w:pPr>
+        <w:rPr>
+          <w:lang w:val="en-US"/>
+        </w:rPr>
+      </w:pPr>
+      <w:r>
+        <w:rPr>
+          <w:lang w:val="en-US"/>
+        </w:rPr>
+        <w:t xml:space="preserve">  the field set will be different — let me know when you want to tackle it.</w:t>
+      </w:r>
     </w:p>
     <w:p>
       <w:pPr>

</xml_diff>